<commit_message>
Add multi-drug response screening pipeline
</commit_message>
<xml_diff>
--- a/docs/Project_Diary.docx
+++ b/docs/Project_Diary.docx
@@ -887,6 +887,623 @@
         </w:rPr>
         <w:t>07.09.26</w:t>
       </w:r>
+    </w:p>
+    <w:p>
+      <w:pPr>
+        <w:spacing w:after="0"/>
+        <w:rPr>
+          <w:lang w:val="en-IL"/>
+        </w:rPr>
+      </w:pPr>
+      <w:proofErr w:type="spellStart"/>
+      <w:r>
+        <w:rPr>
+          <w:lang w:val="en-IL"/>
+        </w:rPr>
+        <w:t>Modeling</w:t>
+      </w:r>
+      <w:proofErr w:type="spellEnd"/>
+      <w:r>
+        <w:rPr>
+          <w:lang w:val="en-IL"/>
+        </w:rPr>
+        <w:t xml:space="preserve"> – Initial Comparison</w:t>
+      </w:r>
+    </w:p>
+    <w:p>
+      <w:pPr>
+        <w:spacing w:after="0"/>
+        <w:rPr>
+          <w:lang w:val="en-IL"/>
+        </w:rPr>
+      </w:pPr>
+      <w:r>
+        <w:rPr>
+          <w:lang w:val="en-IL"/>
+        </w:rPr>
+        <w:t>Three regression approaches were evaluated for predicting AZD2014 drug-response AUC from baseline gene-expression profiles:</w:t>
+      </w:r>
+    </w:p>
+    <w:p>
+      <w:pPr>
+        <w:spacing w:after="0"/>
+        <w:rPr>
+          <w:lang w:val="en-IL"/>
+        </w:rPr>
+      </w:pPr>
+      <w:r>
+        <w:rPr>
+          <w:lang w:val="en-IL"/>
+        </w:rPr>
+        <w:t>1. Elastic Net Regression</w:t>
+      </w:r>
+    </w:p>
+    <w:p>
+      <w:pPr>
+        <w:numPr>
+          <w:ilvl w:val="0"/>
+          <w:numId w:val="3"/>
+        </w:numPr>
+        <w:spacing w:after="0"/>
+        <w:rPr>
+          <w:lang w:val="en-IL"/>
+        </w:rPr>
+      </w:pPr>
+      <w:r>
+        <w:rPr>
+          <w:lang w:val="en-IL"/>
+        </w:rPr>
+        <w:t>Used as a regularized linear model suitable for the high-dimensional setting (</w:t>
+      </w:r>
+      <m:oMath>
+        <m:r>
+          <w:rPr>
+            <w:rFonts w:ascii="Cambria Math" w:hAnsi="Cambria Math"/>
+            <w:lang w:val="en-IL"/>
+          </w:rPr>
+          <m:t>p≫n</m:t>
+        </m:r>
+      </m:oMath>
+      <w:r>
+        <w:rPr>
+          <w:lang w:val="en-IL"/>
+        </w:rPr>
+        <w:t xml:space="preserve">). </w:t>
+      </w:r>
+    </w:p>
+    <w:p>
+      <w:pPr>
+        <w:numPr>
+          <w:ilvl w:val="0"/>
+          <w:numId w:val="3"/>
+        </w:numPr>
+        <w:spacing w:after="0"/>
+        <w:rPr>
+          <w:lang w:val="en-IL"/>
+        </w:rPr>
+      </w:pPr>
+      <w:r>
+        <w:rPr>
+          <w:lang w:val="en-IL"/>
+        </w:rPr>
+        <w:t xml:space="preserve">Standardization and hyperparameter tuning were performed within a pipeline using cross-validation. </w:t>
+      </w:r>
+    </w:p>
+    <w:p>
+      <w:pPr>
+        <w:numPr>
+          <w:ilvl w:val="0"/>
+          <w:numId w:val="3"/>
+        </w:numPr>
+        <w:spacing w:after="0"/>
+        <w:rPr>
+          <w:lang w:val="en-IL"/>
+        </w:rPr>
+      </w:pPr>
+      <w:r>
+        <w:rPr>
+          <w:lang w:val="en-IL"/>
+        </w:rPr>
+        <w:t xml:space="preserve">Test RMSE: ~0.0933. </w:t>
+      </w:r>
+    </w:p>
+    <w:p>
+      <w:pPr>
+        <w:numPr>
+          <w:ilvl w:val="0"/>
+          <w:numId w:val="3"/>
+        </w:numPr>
+        <w:spacing w:after="0"/>
+        <w:rPr>
+          <w:lang w:val="en-IL"/>
+        </w:rPr>
+      </w:pPr>
+      <w:r>
+        <w:rPr>
+          <w:lang w:val="en-IL"/>
+        </w:rPr>
+        <w:t xml:space="preserve">Predictions were concentrated near the mean AUC, indicating limited predictive ability. </w:t>
+      </w:r>
+    </w:p>
+    <w:p>
+      <w:pPr>
+        <w:spacing w:after="0"/>
+        <w:rPr>
+          <w:lang w:val="en-IL"/>
+        </w:rPr>
+      </w:pPr>
+      <w:r>
+        <w:rPr>
+          <w:lang w:val="en-IL"/>
+        </w:rPr>
+        <w:t>2. RBF Support Vector Regression (SVR)</w:t>
+      </w:r>
+    </w:p>
+    <w:p>
+      <w:pPr>
+        <w:numPr>
+          <w:ilvl w:val="0"/>
+          <w:numId w:val="4"/>
+        </w:numPr>
+        <w:spacing w:after="0"/>
+        <w:rPr>
+          <w:lang w:val="en-IL"/>
+        </w:rPr>
+      </w:pPr>
+      <w:r>
+        <w:rPr>
+          <w:lang w:val="en-IL"/>
+        </w:rPr>
+        <w:t xml:space="preserve">Tested whether a nonlinear relationship between gene expression and drug response could improve prediction. </w:t>
+      </w:r>
+    </w:p>
+    <w:p>
+      <w:pPr>
+        <w:numPr>
+          <w:ilvl w:val="0"/>
+          <w:numId w:val="4"/>
+        </w:numPr>
+        <w:spacing w:after="0"/>
+        <w:rPr>
+          <w:lang w:val="en-IL"/>
+        </w:rPr>
+      </w:pPr>
+      <w:r>
+        <w:rPr>
+          <w:lang w:val="en-IL"/>
+        </w:rPr>
+        <w:t xml:space="preserve">Test MAE: 0.0757 </w:t>
+      </w:r>
+    </w:p>
+    <w:p>
+      <w:pPr>
+        <w:numPr>
+          <w:ilvl w:val="0"/>
+          <w:numId w:val="4"/>
+        </w:numPr>
+        <w:spacing w:after="0"/>
+        <w:rPr>
+          <w:lang w:val="en-IL"/>
+        </w:rPr>
+      </w:pPr>
+      <w:r>
+        <w:rPr>
+          <w:lang w:val="en-IL"/>
+        </w:rPr>
+        <w:t xml:space="preserve">Test RMSE: 0.0939 </w:t>
+      </w:r>
+    </w:p>
+    <w:p>
+      <w:pPr>
+        <w:numPr>
+          <w:ilvl w:val="0"/>
+          <w:numId w:val="4"/>
+        </w:numPr>
+        <w:spacing w:after="0"/>
+        <w:rPr>
+          <w:lang w:val="en-IL"/>
+        </w:rPr>
+      </w:pPr>
+      <w:r>
+        <w:rPr>
+          <w:lang w:val="en-IL"/>
+        </w:rPr>
+        <w:t xml:space="preserve">Test </w:t>
+      </w:r>
+      <m:oMath>
+        <m:sSup>
+          <m:sSupPr>
+            <m:ctrlPr>
+              <w:rPr>
+                <w:rFonts w:ascii="Cambria Math" w:hAnsi="Cambria Math"/>
+                <w:lang w:val="en-IL"/>
+              </w:rPr>
+            </m:ctrlPr>
+          </m:sSupPr>
+          <m:e>
+            <m:r>
+              <w:rPr>
+                <w:rFonts w:ascii="Cambria Math" w:hAnsi="Cambria Math"/>
+                <w:lang w:val="en-IL"/>
+              </w:rPr>
+              <m:t>R</m:t>
+            </m:r>
+          </m:e>
+          <m:sup>
+            <m:r>
+              <w:rPr>
+                <w:rFonts w:ascii="Cambria Math" w:hAnsi="Cambria Math"/>
+                <w:lang w:val="en-IL"/>
+              </w:rPr>
+              <m:t>2</m:t>
+            </m:r>
+          </m:sup>
+        </m:sSup>
+      </m:oMath>
+      <w:r>
+        <w:rPr>
+          <w:lang w:val="en-IL"/>
+        </w:rPr>
+        <w:t xml:space="preserve">: 0.017 </w:t>
+      </w:r>
+    </w:p>
+    <w:p>
+      <w:pPr>
+        <w:numPr>
+          <w:ilvl w:val="0"/>
+          <w:numId w:val="4"/>
+        </w:numPr>
+        <w:spacing w:after="0"/>
+        <w:rPr>
+          <w:lang w:val="en-IL"/>
+        </w:rPr>
+      </w:pPr>
+      <w:r>
+        <w:rPr>
+          <w:lang w:val="en-IL"/>
+        </w:rPr>
+        <w:t xml:space="preserve">SVR explained only ~1.7% of the test-set AUC variance and did not improve over Elastic Net. </w:t>
+      </w:r>
+    </w:p>
+    <w:p>
+      <w:pPr>
+        <w:spacing w:after="0"/>
+        <w:rPr>
+          <w:lang w:val="en-IL"/>
+        </w:rPr>
+      </w:pPr>
+      <w:r>
+        <w:rPr>
+          <w:lang w:val="en-IL"/>
+        </w:rPr>
+        <w:t>3. Random Forest Regression</w:t>
+      </w:r>
+    </w:p>
+    <w:p>
+      <w:pPr>
+        <w:numPr>
+          <w:ilvl w:val="0"/>
+          <w:numId w:val="5"/>
+        </w:numPr>
+        <w:spacing w:after="0"/>
+        <w:rPr>
+          <w:lang w:val="en-IL"/>
+        </w:rPr>
+      </w:pPr>
+      <w:r>
+        <w:rPr>
+          <w:lang w:val="en-IL"/>
+        </w:rPr>
+        <w:t xml:space="preserve">Tested a nonlinear tree-based approach capable of </w:t>
+      </w:r>
+      <w:proofErr w:type="spellStart"/>
+      <w:r>
+        <w:rPr>
+          <w:lang w:val="en-IL"/>
+        </w:rPr>
+        <w:t>modeling</w:t>
+      </w:r>
+      <w:proofErr w:type="spellEnd"/>
+      <w:r>
+        <w:rPr>
+          <w:lang w:val="en-IL"/>
+        </w:rPr>
+        <w:t xml:space="preserve"> interactions between genes. </w:t>
+      </w:r>
+    </w:p>
+    <w:p>
+      <w:pPr>
+        <w:numPr>
+          <w:ilvl w:val="0"/>
+          <w:numId w:val="5"/>
+        </w:numPr>
+        <w:spacing w:after="0"/>
+        <w:rPr>
+          <w:lang w:val="en-IL"/>
+        </w:rPr>
+      </w:pPr>
+      <w:r>
+        <w:rPr>
+          <w:lang w:val="en-IL"/>
+        </w:rPr>
+        <w:t xml:space="preserve">Test MAE: 0.0731 </w:t>
+      </w:r>
+    </w:p>
+    <w:p>
+      <w:pPr>
+        <w:numPr>
+          <w:ilvl w:val="0"/>
+          <w:numId w:val="5"/>
+        </w:numPr>
+        <w:spacing w:after="0"/>
+        <w:rPr>
+          <w:lang w:val="en-IL"/>
+        </w:rPr>
+      </w:pPr>
+      <w:r>
+        <w:rPr>
+          <w:lang w:val="en-IL"/>
+        </w:rPr>
+        <w:t xml:space="preserve">Test RMSE: 0.0911 </w:t>
+      </w:r>
+    </w:p>
+    <w:p>
+      <w:pPr>
+        <w:numPr>
+          <w:ilvl w:val="0"/>
+          <w:numId w:val="5"/>
+        </w:numPr>
+        <w:spacing w:after="0"/>
+        <w:rPr>
+          <w:lang w:val="en-IL"/>
+        </w:rPr>
+      </w:pPr>
+      <w:r>
+        <w:rPr>
+          <w:lang w:val="en-IL"/>
+        </w:rPr>
+        <w:t xml:space="preserve">Test </w:t>
+      </w:r>
+      <m:oMath>
+        <m:sSup>
+          <m:sSupPr>
+            <m:ctrlPr>
+              <w:rPr>
+                <w:rFonts w:ascii="Cambria Math" w:hAnsi="Cambria Math"/>
+                <w:lang w:val="en-IL"/>
+              </w:rPr>
+            </m:ctrlPr>
+          </m:sSupPr>
+          <m:e>
+            <m:r>
+              <w:rPr>
+                <w:rFonts w:ascii="Cambria Math" w:hAnsi="Cambria Math"/>
+                <w:lang w:val="en-IL"/>
+              </w:rPr>
+              <m:t>R</m:t>
+            </m:r>
+          </m:e>
+          <m:sup>
+            <m:r>
+              <w:rPr>
+                <w:rFonts w:ascii="Cambria Math" w:hAnsi="Cambria Math"/>
+                <w:lang w:val="en-IL"/>
+              </w:rPr>
+              <m:t>2</m:t>
+            </m:r>
+          </m:sup>
+        </m:sSup>
+      </m:oMath>
+      <w:r>
+        <w:rPr>
+          <w:lang w:val="en-IL"/>
+        </w:rPr>
+        <w:t xml:space="preserve">: 0.075 </w:t>
+      </w:r>
+    </w:p>
+    <w:p>
+      <w:pPr>
+        <w:numPr>
+          <w:ilvl w:val="0"/>
+          <w:numId w:val="5"/>
+        </w:numPr>
+        <w:spacing w:after="0"/>
+        <w:rPr>
+          <w:lang w:val="en-IL"/>
+        </w:rPr>
+      </w:pPr>
+      <w:r>
+        <w:rPr>
+          <w:lang w:val="en-IL"/>
+        </w:rPr>
+        <w:t xml:space="preserve">Train </w:t>
+      </w:r>
+      <m:oMath>
+        <m:sSup>
+          <m:sSupPr>
+            <m:ctrlPr>
+              <w:rPr>
+                <w:rFonts w:ascii="Cambria Math" w:hAnsi="Cambria Math"/>
+                <w:lang w:val="en-IL"/>
+              </w:rPr>
+            </m:ctrlPr>
+          </m:sSupPr>
+          <m:e>
+            <m:r>
+              <w:rPr>
+                <w:rFonts w:ascii="Cambria Math" w:hAnsi="Cambria Math"/>
+                <w:lang w:val="en-IL"/>
+              </w:rPr>
+              <m:t>R</m:t>
+            </m:r>
+          </m:e>
+          <m:sup>
+            <m:r>
+              <w:rPr>
+                <w:rFonts w:ascii="Cambria Math" w:hAnsi="Cambria Math"/>
+                <w:lang w:val="en-IL"/>
+              </w:rPr>
+              <m:t>2</m:t>
+            </m:r>
+          </m:sup>
+        </m:sSup>
+      </m:oMath>
+      <w:r>
+        <w:rPr>
+          <w:lang w:val="en-IL"/>
+        </w:rPr>
+        <w:t xml:space="preserve">: 0.871 </w:t>
+      </w:r>
+    </w:p>
+    <w:p>
+      <w:pPr>
+        <w:numPr>
+          <w:ilvl w:val="0"/>
+          <w:numId w:val="5"/>
+        </w:numPr>
+        <w:spacing w:after="0"/>
+        <w:rPr>
+          <w:lang w:val="en-IL"/>
+        </w:rPr>
+      </w:pPr>
+      <w:r>
+        <w:rPr>
+          <w:lang w:val="en-IL"/>
+        </w:rPr>
+        <w:t xml:space="preserve">Random Forest gave the best test performance of the three models, but the improvement was small. The very large train–test gap indicates substantial overfitting. </w:t>
+      </w:r>
+    </w:p>
+    <w:p>
+      <w:pPr>
+        <w:spacing w:after="0"/>
+        <w:rPr>
+          <w:lang w:val="en-IL"/>
+        </w:rPr>
+      </w:pPr>
+      <w:r>
+        <w:rPr>
+          <w:lang w:val="en-IL"/>
+        </w:rPr>
+        <w:t>Conclusion so far</w:t>
+      </w:r>
+    </w:p>
+    <w:p>
+      <w:pPr>
+        <w:spacing w:after="0"/>
+        <w:rPr>
+          <w:lang w:val="en-IL"/>
+        </w:rPr>
+      </w:pPr>
+      <w:r>
+        <w:rPr>
+          <w:lang w:val="en-IL"/>
+        </w:rPr>
+        <w:lastRenderedPageBreak/>
+        <w:t xml:space="preserve">None of the three substantially different </w:t>
+      </w:r>
+      <w:proofErr w:type="spellStart"/>
+      <w:r>
+        <w:rPr>
+          <w:lang w:val="en-IL"/>
+        </w:rPr>
+        <w:t>modeling</w:t>
+      </w:r>
+      <w:proofErr w:type="spellEnd"/>
+      <w:r>
+        <w:rPr>
+          <w:lang w:val="en-IL"/>
+        </w:rPr>
+        <w:t xml:space="preserve"> approaches produced strong predictive performance. Random Forest performed slightly better, but still explained only ~7.5% of the variance in unseen cell lines.</w:t>
+      </w:r>
+    </w:p>
+    <w:p>
+      <w:pPr>
+        <w:spacing w:after="0"/>
+        <w:rPr>
+          <w:lang w:val="en-IL"/>
+        </w:rPr>
+      </w:pPr>
+      <w:r>
+        <w:rPr>
+          <w:lang w:val="en-IL"/>
+        </w:rPr>
+        <w:t>Because linear, kernel-based nonlinear, and tree-based nonlinear models all performed poorly, the current results suggest that simply trying increasingly complex algorithms may not solve the problem. Possible explanations include the high-dimensional setting (~19,000 genes vs. ~600 training samples), weak gene-expression signal for AZD2014 response, large amounts of irrelevant/noisy expression information, or biological factors not represented by baseline gene expression.</w:t>
+      </w:r>
+    </w:p>
+    <w:p>
+      <w:pPr>
+        <w:spacing w:after="0"/>
+        <w:rPr>
+          <w:lang w:val="en-IL"/>
+        </w:rPr>
+      </w:pPr>
+      <w:r>
+        <w:rPr>
+          <w:lang w:val="en-IL"/>
+        </w:rPr>
+        <w:t>The next stage should therefore focus not only on additional algorithms, but on understanding the prediction problem itself—for example, feature reduction/selection, biological structure and cancer lineage effects, and whether other drugs have stronger gene-expression-based predictive signals.</w:t>
+      </w:r>
+    </w:p>
+    <w:p>
+      <w:pPr>
+        <w:spacing w:after="0"/>
+        <w:rPr>
+          <w:lang w:val="en-IL"/>
+        </w:rPr>
+      </w:pPr>
+    </w:p>
+    <w:p>
+      <w:pPr>
+        <w:rPr>
+          <w:b/>
+          <w:bCs/>
+        </w:rPr>
+      </w:pPr>
+      <w:r>
+        <w:rPr>
+          <w:b/>
+          <w:bCs/>
+        </w:rPr>
+        <w:t>0</w:t>
+      </w:r>
+      <w:r>
+        <w:rPr>
+          <w:b/>
+          <w:bCs/>
+        </w:rPr>
+        <w:t>8</w:t>
+      </w:r>
+      <w:r>
+        <w:rPr>
+          <w:b/>
+          <w:bCs/>
+        </w:rPr>
+        <w:t>.09.26</w:t>
+      </w:r>
+    </w:p>
+    <w:p>
+      <w:pPr>
+        <w:spacing w:after="0"/>
+        <w:rPr>
+          <w:lang w:val="en-IL"/>
+        </w:rPr>
+      </w:pPr>
+    </w:p>
+    <w:p>
+      <w:pPr>
+        <w:spacing w:after="0"/>
+        <w:rPr>
+          <w:lang w:val="en-IL"/>
+        </w:rPr>
+      </w:pPr>
+    </w:p>
+    <w:p>
+      <w:pPr>
+        <w:spacing w:after="0"/>
+        <w:rPr>
+          <w:lang w:val="en-US"/>
+        </w:rPr>
+      </w:pPr>
     </w:p>
     <w:sectPr>
       <w:pgSz w:w="11906" w:h="16838"/>
@@ -901,6 +1518,304 @@
 <file path=word/numbering.xml><?xml version="1.0" encoding="utf-8"?>
 <w:numbering xmlns:wpc="http://schemas.microsoft.com/office/word/2010/wordprocessingCanvas" xmlns:cx="http://schemas.microsoft.com/office/drawing/2014/chartex" xmlns:cx1="http://schemas.microsoft.com/office/drawing/2015/9/8/chartex" xmlns:cx2="http://schemas.microsoft.com/office/drawing/2015/10/21/chartex" xmlns:cx3="http://schemas.microsoft.com/office/drawing/2016/5/9/chartex" xmlns:cx4="http://schemas.microsoft.com/office/drawing/2016/5/10/chartex" xmlns:cx5="http://schemas.microsoft.com/office/drawing/2016/5/11/chartex" xmlns:cx6="http://schemas.microsoft.com/office/drawing/2016/5/12/chartex" xmlns:cx7="http://schemas.microsoft.com/office/drawing/2016/5/13/chartex" xmlns:cx8="http://schemas.microsoft.com/office/drawing/2016/5/14/chartex" xmlns:mc="http://schemas.openxmlformats.org/markup-compatibility/2006" xmlns:aink="http://schemas.microsoft.com/office/drawing/2016/ink" xmlns:am3d="http://schemas.microsoft.com/office/drawing/2017/model3d" xmlns:o="urn:schemas-microsoft-com:office:office" xmlns:oel="http://schemas.microsoft.com/office/2019/extlst" xmlns:r="http://schemas.openxmlformats.org/officeDocument/2006/relationships" xmlns:m="http://schemas.openxmlformats.org/officeDocument/2006/math" xmlns:v="urn:schemas-microsoft-com:vml" xmlns:wp14="http://schemas.microsoft.com/office/word/2010/wordprocessingDrawing" xmlns:wp="http://schemas.openxmlformats.org/drawingml/2006/wordprocessingDrawing" xmlns:w10="urn:schemas-microsoft-com:office:word" xmlns:w="http://schemas.openxmlformats.org/wordprocessingml/2006/main" xmlns:w14="http://schemas.microsoft.com/office/word/2010/wordml" xmlns:w15="http://schemas.microsoft.com/office/word/2012/wordml" xmlns:w16cex="http://schemas.microsoft.com/office/word/2018/wordml/cex" xmlns:w16cid="http://schemas.microsoft.com/office/word/2016/wordml/cid" xmlns:w16="http://schemas.microsoft.com/office/word/2018/wordml" xmlns:w16du="http://schemas.microsoft.com/office/word/2023/wordml/word16du" xmlns:w16sdtdh="http://schemas.microsoft.com/office/word/2020/wordml/sdtdatahash" xmlns:w16sdtfl="http://schemas.microsoft.com/office/word/2024/wordml/sdtformatlock" xmlns:w16se="http://schemas.microsoft.com/office/word/2015/wordml/symex" xmlns:wpg="http://schemas.microsoft.com/office/word/2010/wordprocessingGroup" xmlns:wpi="http://schemas.microsoft.com/office/word/2010/wordprocessingInk" xmlns:wne="http://schemas.microsoft.com/office/word/2006/wordml" xmlns:wps="http://schemas.microsoft.com/office/word/2010/wordprocessingShape" mc:Ignorable="w14 w15 w16se w16cid w16 w16cex w16sdtdh w16sdtfl w16du wp14">
   <w:abstractNum w:abstractNumId="0" w15:restartNumberingAfterBreak="0">
+    <w:nsid w:val="14BF091E"/>
+    <w:multiLevelType w:val="multilevel"/>
+    <w:tmpl w:val="D0D4DCE0"/>
+    <w:lvl w:ilvl="0">
+      <w:start w:val="1"/>
+      <w:numFmt w:val="bullet"/>
+      <w:lvlText w:val=""/>
+      <w:lvlJc w:val="left"/>
+      <w:pPr>
+        <w:tabs>
+          <w:tab w:val="num" w:pos="720"/>
+        </w:tabs>
+        <w:ind w:left="720" w:hanging="360"/>
+      </w:pPr>
+      <w:rPr>
+        <w:rFonts w:ascii="Symbol" w:hAnsi="Symbol" w:hint="default"/>
+        <w:sz w:val="20"/>
+      </w:rPr>
+    </w:lvl>
+    <w:lvl w:ilvl="1" w:tentative="1">
+      <w:start w:val="1"/>
+      <w:numFmt w:val="bullet"/>
+      <w:lvlText w:val="o"/>
+      <w:lvlJc w:val="left"/>
+      <w:pPr>
+        <w:tabs>
+          <w:tab w:val="num" w:pos="1440"/>
+        </w:tabs>
+        <w:ind w:left="1440" w:hanging="360"/>
+      </w:pPr>
+      <w:rPr>
+        <w:rFonts w:ascii="Courier New" w:hAnsi="Courier New" w:hint="default"/>
+        <w:sz w:val="20"/>
+      </w:rPr>
+    </w:lvl>
+    <w:lvl w:ilvl="2" w:tentative="1">
+      <w:start w:val="1"/>
+      <w:numFmt w:val="bullet"/>
+      <w:lvlText w:val=""/>
+      <w:lvlJc w:val="left"/>
+      <w:pPr>
+        <w:tabs>
+          <w:tab w:val="num" w:pos="2160"/>
+        </w:tabs>
+        <w:ind w:left="2160" w:hanging="360"/>
+      </w:pPr>
+      <w:rPr>
+        <w:rFonts w:ascii="Wingdings" w:hAnsi="Wingdings" w:hint="default"/>
+        <w:sz w:val="20"/>
+      </w:rPr>
+    </w:lvl>
+    <w:lvl w:ilvl="3" w:tentative="1">
+      <w:start w:val="1"/>
+      <w:numFmt w:val="bullet"/>
+      <w:lvlText w:val=""/>
+      <w:lvlJc w:val="left"/>
+      <w:pPr>
+        <w:tabs>
+          <w:tab w:val="num" w:pos="2880"/>
+        </w:tabs>
+        <w:ind w:left="2880" w:hanging="360"/>
+      </w:pPr>
+      <w:rPr>
+        <w:rFonts w:ascii="Wingdings" w:hAnsi="Wingdings" w:hint="default"/>
+        <w:sz w:val="20"/>
+      </w:rPr>
+    </w:lvl>
+    <w:lvl w:ilvl="4" w:tentative="1">
+      <w:start w:val="1"/>
+      <w:numFmt w:val="bullet"/>
+      <w:lvlText w:val=""/>
+      <w:lvlJc w:val="left"/>
+      <w:pPr>
+        <w:tabs>
+          <w:tab w:val="num" w:pos="3600"/>
+        </w:tabs>
+        <w:ind w:left="3600" w:hanging="360"/>
+      </w:pPr>
+      <w:rPr>
+        <w:rFonts w:ascii="Wingdings" w:hAnsi="Wingdings" w:hint="default"/>
+        <w:sz w:val="20"/>
+      </w:rPr>
+    </w:lvl>
+    <w:lvl w:ilvl="5" w:tentative="1">
+      <w:start w:val="1"/>
+      <w:numFmt w:val="bullet"/>
+      <w:lvlText w:val=""/>
+      <w:lvlJc w:val="left"/>
+      <w:pPr>
+        <w:tabs>
+          <w:tab w:val="num" w:pos="4320"/>
+        </w:tabs>
+        <w:ind w:left="4320" w:hanging="360"/>
+      </w:pPr>
+      <w:rPr>
+        <w:rFonts w:ascii="Wingdings" w:hAnsi="Wingdings" w:hint="default"/>
+        <w:sz w:val="20"/>
+      </w:rPr>
+    </w:lvl>
+    <w:lvl w:ilvl="6" w:tentative="1">
+      <w:start w:val="1"/>
+      <w:numFmt w:val="bullet"/>
+      <w:lvlText w:val=""/>
+      <w:lvlJc w:val="left"/>
+      <w:pPr>
+        <w:tabs>
+          <w:tab w:val="num" w:pos="5040"/>
+        </w:tabs>
+        <w:ind w:left="5040" w:hanging="360"/>
+      </w:pPr>
+      <w:rPr>
+        <w:rFonts w:ascii="Wingdings" w:hAnsi="Wingdings" w:hint="default"/>
+        <w:sz w:val="20"/>
+      </w:rPr>
+    </w:lvl>
+    <w:lvl w:ilvl="7" w:tentative="1">
+      <w:start w:val="1"/>
+      <w:numFmt w:val="bullet"/>
+      <w:lvlText w:val=""/>
+      <w:lvlJc w:val="left"/>
+      <w:pPr>
+        <w:tabs>
+          <w:tab w:val="num" w:pos="5760"/>
+        </w:tabs>
+        <w:ind w:left="5760" w:hanging="360"/>
+      </w:pPr>
+      <w:rPr>
+        <w:rFonts w:ascii="Wingdings" w:hAnsi="Wingdings" w:hint="default"/>
+        <w:sz w:val="20"/>
+      </w:rPr>
+    </w:lvl>
+    <w:lvl w:ilvl="8" w:tentative="1">
+      <w:start w:val="1"/>
+      <w:numFmt w:val="bullet"/>
+      <w:lvlText w:val=""/>
+      <w:lvlJc w:val="left"/>
+      <w:pPr>
+        <w:tabs>
+          <w:tab w:val="num" w:pos="6480"/>
+        </w:tabs>
+        <w:ind w:left="6480" w:hanging="360"/>
+      </w:pPr>
+      <w:rPr>
+        <w:rFonts w:ascii="Wingdings" w:hAnsi="Wingdings" w:hint="default"/>
+        <w:sz w:val="20"/>
+      </w:rPr>
+    </w:lvl>
+  </w:abstractNum>
+  <w:abstractNum w:abstractNumId="1" w15:restartNumberingAfterBreak="0">
+    <w:nsid w:val="1BFA07AB"/>
+    <w:multiLevelType w:val="multilevel"/>
+    <w:tmpl w:val="D870F87A"/>
+    <w:lvl w:ilvl="0">
+      <w:start w:val="1"/>
+      <w:numFmt w:val="bullet"/>
+      <w:lvlText w:val=""/>
+      <w:lvlJc w:val="left"/>
+      <w:pPr>
+        <w:tabs>
+          <w:tab w:val="num" w:pos="720"/>
+        </w:tabs>
+        <w:ind w:left="720" w:hanging="360"/>
+      </w:pPr>
+      <w:rPr>
+        <w:rFonts w:ascii="Symbol" w:hAnsi="Symbol" w:hint="default"/>
+        <w:sz w:val="20"/>
+      </w:rPr>
+    </w:lvl>
+    <w:lvl w:ilvl="1" w:tentative="1">
+      <w:start w:val="1"/>
+      <w:numFmt w:val="bullet"/>
+      <w:lvlText w:val="o"/>
+      <w:lvlJc w:val="left"/>
+      <w:pPr>
+        <w:tabs>
+          <w:tab w:val="num" w:pos="1440"/>
+        </w:tabs>
+        <w:ind w:left="1440" w:hanging="360"/>
+      </w:pPr>
+      <w:rPr>
+        <w:rFonts w:ascii="Courier New" w:hAnsi="Courier New" w:hint="default"/>
+        <w:sz w:val="20"/>
+      </w:rPr>
+    </w:lvl>
+    <w:lvl w:ilvl="2" w:tentative="1">
+      <w:start w:val="1"/>
+      <w:numFmt w:val="bullet"/>
+      <w:lvlText w:val=""/>
+      <w:lvlJc w:val="left"/>
+      <w:pPr>
+        <w:tabs>
+          <w:tab w:val="num" w:pos="2160"/>
+        </w:tabs>
+        <w:ind w:left="2160" w:hanging="360"/>
+      </w:pPr>
+      <w:rPr>
+        <w:rFonts w:ascii="Wingdings" w:hAnsi="Wingdings" w:hint="default"/>
+        <w:sz w:val="20"/>
+      </w:rPr>
+    </w:lvl>
+    <w:lvl w:ilvl="3" w:tentative="1">
+      <w:start w:val="1"/>
+      <w:numFmt w:val="bullet"/>
+      <w:lvlText w:val=""/>
+      <w:lvlJc w:val="left"/>
+      <w:pPr>
+        <w:tabs>
+          <w:tab w:val="num" w:pos="2880"/>
+        </w:tabs>
+        <w:ind w:left="2880" w:hanging="360"/>
+      </w:pPr>
+      <w:rPr>
+        <w:rFonts w:ascii="Wingdings" w:hAnsi="Wingdings" w:hint="default"/>
+        <w:sz w:val="20"/>
+      </w:rPr>
+    </w:lvl>
+    <w:lvl w:ilvl="4" w:tentative="1">
+      <w:start w:val="1"/>
+      <w:numFmt w:val="bullet"/>
+      <w:lvlText w:val=""/>
+      <w:lvlJc w:val="left"/>
+      <w:pPr>
+        <w:tabs>
+          <w:tab w:val="num" w:pos="3600"/>
+        </w:tabs>
+        <w:ind w:left="3600" w:hanging="360"/>
+      </w:pPr>
+      <w:rPr>
+        <w:rFonts w:ascii="Wingdings" w:hAnsi="Wingdings" w:hint="default"/>
+        <w:sz w:val="20"/>
+      </w:rPr>
+    </w:lvl>
+    <w:lvl w:ilvl="5" w:tentative="1">
+      <w:start w:val="1"/>
+      <w:numFmt w:val="bullet"/>
+      <w:lvlText w:val=""/>
+      <w:lvlJc w:val="left"/>
+      <w:pPr>
+        <w:tabs>
+          <w:tab w:val="num" w:pos="4320"/>
+        </w:tabs>
+        <w:ind w:left="4320" w:hanging="360"/>
+      </w:pPr>
+      <w:rPr>
+        <w:rFonts w:ascii="Wingdings" w:hAnsi="Wingdings" w:hint="default"/>
+        <w:sz w:val="20"/>
+      </w:rPr>
+    </w:lvl>
+    <w:lvl w:ilvl="6" w:tentative="1">
+      <w:start w:val="1"/>
+      <w:numFmt w:val="bullet"/>
+      <w:lvlText w:val=""/>
+      <w:lvlJc w:val="left"/>
+      <w:pPr>
+        <w:tabs>
+          <w:tab w:val="num" w:pos="5040"/>
+        </w:tabs>
+        <w:ind w:left="5040" w:hanging="360"/>
+      </w:pPr>
+      <w:rPr>
+        <w:rFonts w:ascii="Wingdings" w:hAnsi="Wingdings" w:hint="default"/>
+        <w:sz w:val="20"/>
+      </w:rPr>
+    </w:lvl>
+    <w:lvl w:ilvl="7" w:tentative="1">
+      <w:start w:val="1"/>
+      <w:numFmt w:val="bullet"/>
+      <w:lvlText w:val=""/>
+      <w:lvlJc w:val="left"/>
+      <w:pPr>
+        <w:tabs>
+          <w:tab w:val="num" w:pos="5760"/>
+        </w:tabs>
+        <w:ind w:left="5760" w:hanging="360"/>
+      </w:pPr>
+      <w:rPr>
+        <w:rFonts w:ascii="Wingdings" w:hAnsi="Wingdings" w:hint="default"/>
+        <w:sz w:val="20"/>
+      </w:rPr>
+    </w:lvl>
+    <w:lvl w:ilvl="8" w:tentative="1">
+      <w:start w:val="1"/>
+      <w:numFmt w:val="bullet"/>
+      <w:lvlText w:val=""/>
+      <w:lvlJc w:val="left"/>
+      <w:pPr>
+        <w:tabs>
+          <w:tab w:val="num" w:pos="6480"/>
+        </w:tabs>
+        <w:ind w:left="6480" w:hanging="360"/>
+      </w:pPr>
+      <w:rPr>
+        <w:rFonts w:ascii="Wingdings" w:hAnsi="Wingdings" w:hint="default"/>
+        <w:sz w:val="20"/>
+      </w:rPr>
+    </w:lvl>
+  </w:abstractNum>
+  <w:abstractNum w:abstractNumId="2" w15:restartNumberingAfterBreak="0">
     <w:nsid w:val="30364BCE"/>
     <w:multiLevelType w:val="multilevel"/>
     <w:tmpl w:val="AFF4D6F6"/>
@@ -1049,7 +1964,156 @@
       </w:rPr>
     </w:lvl>
   </w:abstractNum>
-  <w:abstractNum w:abstractNumId="1" w15:restartNumberingAfterBreak="0">
+  <w:abstractNum w:abstractNumId="3" w15:restartNumberingAfterBreak="0">
+    <w:nsid w:val="60F307F6"/>
+    <w:multiLevelType w:val="multilevel"/>
+    <w:tmpl w:val="19B8FBC0"/>
+    <w:lvl w:ilvl="0">
+      <w:start w:val="1"/>
+      <w:numFmt w:val="bullet"/>
+      <w:lvlText w:val=""/>
+      <w:lvlJc w:val="left"/>
+      <w:pPr>
+        <w:tabs>
+          <w:tab w:val="num" w:pos="720"/>
+        </w:tabs>
+        <w:ind w:left="720" w:hanging="360"/>
+      </w:pPr>
+      <w:rPr>
+        <w:rFonts w:ascii="Symbol" w:hAnsi="Symbol" w:hint="default"/>
+        <w:sz w:val="20"/>
+      </w:rPr>
+    </w:lvl>
+    <w:lvl w:ilvl="1" w:tentative="1">
+      <w:start w:val="1"/>
+      <w:numFmt w:val="bullet"/>
+      <w:lvlText w:val="o"/>
+      <w:lvlJc w:val="left"/>
+      <w:pPr>
+        <w:tabs>
+          <w:tab w:val="num" w:pos="1440"/>
+        </w:tabs>
+        <w:ind w:left="1440" w:hanging="360"/>
+      </w:pPr>
+      <w:rPr>
+        <w:rFonts w:ascii="Courier New" w:hAnsi="Courier New" w:hint="default"/>
+        <w:sz w:val="20"/>
+      </w:rPr>
+    </w:lvl>
+    <w:lvl w:ilvl="2" w:tentative="1">
+      <w:start w:val="1"/>
+      <w:numFmt w:val="bullet"/>
+      <w:lvlText w:val=""/>
+      <w:lvlJc w:val="left"/>
+      <w:pPr>
+        <w:tabs>
+          <w:tab w:val="num" w:pos="2160"/>
+        </w:tabs>
+        <w:ind w:left="2160" w:hanging="360"/>
+      </w:pPr>
+      <w:rPr>
+        <w:rFonts w:ascii="Wingdings" w:hAnsi="Wingdings" w:hint="default"/>
+        <w:sz w:val="20"/>
+      </w:rPr>
+    </w:lvl>
+    <w:lvl w:ilvl="3" w:tentative="1">
+      <w:start w:val="1"/>
+      <w:numFmt w:val="bullet"/>
+      <w:lvlText w:val=""/>
+      <w:lvlJc w:val="left"/>
+      <w:pPr>
+        <w:tabs>
+          <w:tab w:val="num" w:pos="2880"/>
+        </w:tabs>
+        <w:ind w:left="2880" w:hanging="360"/>
+      </w:pPr>
+      <w:rPr>
+        <w:rFonts w:ascii="Wingdings" w:hAnsi="Wingdings" w:hint="default"/>
+        <w:sz w:val="20"/>
+      </w:rPr>
+    </w:lvl>
+    <w:lvl w:ilvl="4" w:tentative="1">
+      <w:start w:val="1"/>
+      <w:numFmt w:val="bullet"/>
+      <w:lvlText w:val=""/>
+      <w:lvlJc w:val="left"/>
+      <w:pPr>
+        <w:tabs>
+          <w:tab w:val="num" w:pos="3600"/>
+        </w:tabs>
+        <w:ind w:left="3600" w:hanging="360"/>
+      </w:pPr>
+      <w:rPr>
+        <w:rFonts w:ascii="Wingdings" w:hAnsi="Wingdings" w:hint="default"/>
+        <w:sz w:val="20"/>
+      </w:rPr>
+    </w:lvl>
+    <w:lvl w:ilvl="5" w:tentative="1">
+      <w:start w:val="1"/>
+      <w:numFmt w:val="bullet"/>
+      <w:lvlText w:val=""/>
+      <w:lvlJc w:val="left"/>
+      <w:pPr>
+        <w:tabs>
+          <w:tab w:val="num" w:pos="4320"/>
+        </w:tabs>
+        <w:ind w:left="4320" w:hanging="360"/>
+      </w:pPr>
+      <w:rPr>
+        <w:rFonts w:ascii="Wingdings" w:hAnsi="Wingdings" w:hint="default"/>
+        <w:sz w:val="20"/>
+      </w:rPr>
+    </w:lvl>
+    <w:lvl w:ilvl="6" w:tentative="1">
+      <w:start w:val="1"/>
+      <w:numFmt w:val="bullet"/>
+      <w:lvlText w:val=""/>
+      <w:lvlJc w:val="left"/>
+      <w:pPr>
+        <w:tabs>
+          <w:tab w:val="num" w:pos="5040"/>
+        </w:tabs>
+        <w:ind w:left="5040" w:hanging="360"/>
+      </w:pPr>
+      <w:rPr>
+        <w:rFonts w:ascii="Wingdings" w:hAnsi="Wingdings" w:hint="default"/>
+        <w:sz w:val="20"/>
+      </w:rPr>
+    </w:lvl>
+    <w:lvl w:ilvl="7" w:tentative="1">
+      <w:start w:val="1"/>
+      <w:numFmt w:val="bullet"/>
+      <w:lvlText w:val=""/>
+      <w:lvlJc w:val="left"/>
+      <w:pPr>
+        <w:tabs>
+          <w:tab w:val="num" w:pos="5760"/>
+        </w:tabs>
+        <w:ind w:left="5760" w:hanging="360"/>
+      </w:pPr>
+      <w:rPr>
+        <w:rFonts w:ascii="Wingdings" w:hAnsi="Wingdings" w:hint="default"/>
+        <w:sz w:val="20"/>
+      </w:rPr>
+    </w:lvl>
+    <w:lvl w:ilvl="8" w:tentative="1">
+      <w:start w:val="1"/>
+      <w:numFmt w:val="bullet"/>
+      <w:lvlText w:val=""/>
+      <w:lvlJc w:val="left"/>
+      <w:pPr>
+        <w:tabs>
+          <w:tab w:val="num" w:pos="6480"/>
+        </w:tabs>
+        <w:ind w:left="6480" w:hanging="360"/>
+      </w:pPr>
+      <w:rPr>
+        <w:rFonts w:ascii="Wingdings" w:hAnsi="Wingdings" w:hint="default"/>
+        <w:sz w:val="20"/>
+      </w:rPr>
+    </w:lvl>
+  </w:abstractNum>
+  <w:abstractNum w:abstractNumId="4" w15:restartNumberingAfterBreak="0">
     <w:nsid w:val="653D2102"/>
     <w:multiLevelType w:val="multilevel"/>
     <w:tmpl w:val="1FBE252E"/>
@@ -1199,10 +2263,19 @@
     </w:lvl>
   </w:abstractNum>
   <w:num w:numId="1" w16cid:durableId="1516458123">
-    <w:abstractNumId w:val="1"/>
+    <w:abstractNumId w:val="4"/>
   </w:num>
   <w:num w:numId="2" w16cid:durableId="638808306">
+    <w:abstractNumId w:val="2"/>
+  </w:num>
+  <w:num w:numId="3" w16cid:durableId="1139155501">
+    <w:abstractNumId w:val="3"/>
+  </w:num>
+  <w:num w:numId="4" w16cid:durableId="41489244">
     <w:abstractNumId w:val="0"/>
+  </w:num>
+  <w:num w:numId="5" w16cid:durableId="1905990519">
+    <w:abstractNumId w:val="1"/>
   </w:num>
 </w:numbering>
 </file>
@@ -1810,7 +2883,6 @@
   <w:style w:type="character" w:default="1" w:styleId="DefaultParagraphFont">
     <w:name w:val="Default Paragraph Font"/>
     <w:uiPriority w:val="1"/>
-    <w:semiHidden/>
     <w:unhideWhenUsed/>
   </w:style>
   <w:style w:type="table" w:default="1" w:styleId="TableNormal">
@@ -2124,6 +3196,36 @@
       <w:spacing w:val="5"/>
     </w:rPr>
   </w:style>
+  <w:style w:type="paragraph" w:styleId="HTMLPreformatted">
+    <w:name w:val="HTML Preformatted"/>
+    <w:basedOn w:val="Normal"/>
+    <w:link w:val="HTMLPreformattedChar"/>
+    <w:uiPriority w:val="99"/>
+    <w:semiHidden/>
+    <w:unhideWhenUsed/>
+    <w:rsid w:val="00050464"/>
+    <w:pPr>
+      <w:spacing w:after="0" w:line="240" w:lineRule="auto"/>
+    </w:pPr>
+    <w:rPr>
+      <w:rFonts w:ascii="Consolas" w:hAnsi="Consolas"/>
+      <w:sz w:val="20"/>
+      <w:szCs w:val="20"/>
+    </w:rPr>
+  </w:style>
+  <w:style w:type="character" w:customStyle="1" w:styleId="HTMLPreformattedChar">
+    <w:name w:val="HTML Preformatted Char"/>
+    <w:basedOn w:val="DefaultParagraphFont"/>
+    <w:link w:val="HTMLPreformatted"/>
+    <w:uiPriority w:val="99"/>
+    <w:semiHidden/>
+    <w:rsid w:val="00050464"/>
+    <w:rPr>
+      <w:rFonts w:ascii="Consolas" w:hAnsi="Consolas"/>
+      <w:sz w:val="20"/>
+      <w:szCs w:val="20"/>
+    </w:rPr>
+  </w:style>
 </w:styles>
 </file>
 

</xml_diff>